<commit_message>
Module 1.2 assignment 6/3/26
</commit_message>
<xml_diff>
--- a/module-1/Carbajal-Assignment1_2.docx
+++ b/module-1/Carbajal-Assignment1_2.docx
@@ -10,6 +10,10 @@
     <w:p>
       <w:pPr>
         <w:jc w:val="center"/>
+        <w:rPr>
+          <w:b/>
+          <w:bCs/>
+        </w:rPr>
       </w:pPr>
       <w:hyperlink r:id="rId6" w:history="1">
         <w:r>
@@ -19,12 +23,59 @@
           <w:t>https://github.com/NCarbajalBellevue/csd-325.git</w:t>
         </w:r>
       </w:hyperlink>
+      <w:r>
+        <w:br/>
+      </w:r>
+      <w:r>
+        <w:rPr>
+          <w:b/>
+          <w:bCs/>
+        </w:rPr>
+        <w:drawing>
+          <wp:inline distT="0" distB="0" distL="0" distR="0" wp14:anchorId="5C54D81E" wp14:editId="7E9353CF">
+            <wp:extent cx="5943600" cy="2892425"/>
+            <wp:effectExtent l="0" t="0" r="0" b="3175"/>
+            <wp:docPr id="117011832" name="Picture 1"/>
+            <wp:cNvGraphicFramePr>
+              <a:graphicFrameLocks xmlns:a="http://schemas.openxmlformats.org/drawingml/2006/main" noChangeAspect="1"/>
+            </wp:cNvGraphicFramePr>
+            <a:graphic xmlns:a="http://schemas.openxmlformats.org/drawingml/2006/main">
+              <a:graphicData uri="http://schemas.openxmlformats.org/drawingml/2006/picture">
+                <pic:pic xmlns:pic="http://schemas.openxmlformats.org/drawingml/2006/picture">
+                  <pic:nvPicPr>
+                    <pic:cNvPr id="117011832" name=""/>
+                    <pic:cNvPicPr/>
+                  </pic:nvPicPr>
+                  <pic:blipFill>
+                    <a:blip r:embed="rId7"/>
+                    <a:stretch>
+                      <a:fillRect/>
+                    </a:stretch>
+                  </pic:blipFill>
+                  <pic:spPr>
+                    <a:xfrm>
+                      <a:off x="0" y="0"/>
+                      <a:ext cx="5943600" cy="2892425"/>
+                    </a:xfrm>
+                    <a:prstGeom prst="rect">
+                      <a:avLst/>
+                    </a:prstGeom>
+                  </pic:spPr>
+                </pic:pic>
+              </a:graphicData>
+            </a:graphic>
+          </wp:inline>
+        </w:drawing>
+      </w:r>
     </w:p>
     <w:p>
       <w:pPr>
         <w:jc w:val="center"/>
       </w:pPr>
       <w:r>
+        <w:rPr>
+          <w:noProof/>
+        </w:rPr>
         <w:drawing>
           <wp:inline distT="0" distB="0" distL="0" distR="0" wp14:anchorId="05819D21" wp14:editId="5875A253">
             <wp:extent cx="3962953" cy="1552792"/>
@@ -41,7 +92,7 @@
                     <pic:cNvPicPr/>
                   </pic:nvPicPr>
                   <pic:blipFill>
-                    <a:blip r:embed="rId7"/>
+                    <a:blip r:embed="rId8"/>
                     <a:stretch>
                       <a:fillRect/>
                     </a:stretch>
@@ -68,7 +119,7 @@
       </w:pPr>
     </w:p>
     <w:sectPr>
-      <w:headerReference w:type="default" r:id="rId8"/>
+      <w:headerReference w:type="default" r:id="rId9"/>
       <w:pgSz w:w="12240" w:h="15840"/>
       <w:pgMar w:top="1440" w:right="1440" w:bottom="1440" w:left="1440" w:header="720" w:footer="720" w:gutter="0"/>
       <w:cols w:space="720"/>
@@ -758,6 +809,7 @@
   <w:style w:type="character" w:default="1" w:styleId="DefaultParagraphFont">
     <w:name w:val="Default Paragraph Font"/>
     <w:uiPriority w:val="1"/>
+    <w:semiHidden/>
     <w:unhideWhenUsed/>
   </w:style>
   <w:style w:type="table" w:default="1" w:styleId="TableNormal">

</xml_diff>